<commit_message>
Brillar, as it was: ADK workflow builder, CRM service, RAG fetch layer.
Every variant now shares one Brillar section. Ingestion belonged to another
team and pytest ran in pre-commit hooks, so those claims are gone.

Co-authored-by: linn-dev-gmi <linn@globalmagicko.com>
</commit_message>
<xml_diff>
--- a/content/about/resume-fde.docx
+++ b/content/about/resume-fde.docx
@@ -109,7 +109,7 @@
     </w:p>
     <w:p>
       <w:pPr>
-        <w:spacing w:before="160" w:after="40"/>
+        <w:spacing w:before="200" w:after="60"/>
       </w:pPr>
       <w:r>
         <w:rPr>
@@ -158,7 +158,7 @@
     </w:p>
     <w:p>
       <w:pPr>
-        <w:spacing w:before="160" w:after="40"/>
+        <w:spacing w:before="200" w:after="60"/>
       </w:pPr>
       <w:r>
         <w:rPr>
@@ -235,7 +235,7 @@
           <w:b w:val="0"/>
           <w:i/>
         </w:rPr>
-        <w:t xml:space="preserve"> | Full-time | Apr 2026 - Present</w:t>
+        <w:t xml:space="preserve"> | Bangkok, Thailand | Full-time | Apr 2026 - Present</w:t>
       </w:r>
     </w:p>
     <w:p>
@@ -444,7 +444,7 @@
           <w:b w:val="0"/>
           <w:i/>
         </w:rPr>
-        <w:t xml:space="preserve"> | Singapore (Remote) | May 2025 - Apr 2026</w:t>
+        <w:t xml:space="preserve"> | Singapore (Remote) | Full-time | May 2025 - Apr 2026</w:t>
       </w:r>
     </w:p>
     <w:p>
@@ -458,7 +458,23 @@
           <w:b w:val="0"/>
           <w:i w:val="0"/>
         </w:rPr>
-        <w:t>Owned two Python (FastAPI) microservices end to end on a remote team, from design to production operations.</w:t>
+        <w:t xml:space="preserve">Built a </w:t>
+      </w:r>
+      <w:r>
+        <w:rPr>
+          <w:rFonts w:ascii="Times New Roman" w:hAnsi="Times New Roman" w:eastAsia="Times New Roman"/>
+          <w:b/>
+          <w:i w:val="0"/>
+        </w:rPr>
+        <w:t>Google ADK</w:t>
+      </w:r>
+      <w:r>
+        <w:rPr>
+          <w:rFonts w:ascii="Times New Roman" w:hAnsi="Times New Roman" w:eastAsia="Times New Roman"/>
+          <w:b w:val="0"/>
+          <w:i w:val="0"/>
+        </w:rPr>
+        <w:t xml:space="preserve"> multi-agent workflow platform, the CRM integration service (Zoho, SalesIQ, Chatwoot, Zendesk) and RAG retrieval over Crawl4AI and Docling.</w:t>
       </w:r>
     </w:p>
     <w:p>
@@ -472,21 +488,7 @@
           <w:b w:val="0"/>
           <w:i w:val="0"/>
         </w:rPr>
-        <w:t>Built the shared CRM integration service (Zoho, Chatwoot, Zendesk) used by several products, and the document ingestion pipeline that turns uploads and crawled pages into text for LLM workflows.</w:t>
-      </w:r>
-    </w:p>
-    <w:p>
-      <w:pPr>
-        <w:pStyle w:val="ListBullet"/>
-        <w:spacing w:after="20"/>
-      </w:pPr>
-      <w:r>
-        <w:rPr>
-          <w:rFonts w:ascii="Times New Roman" w:hAnsi="Times New Roman" w:eastAsia="Times New Roman"/>
-          <w:b w:val="0"/>
-          <w:i w:val="0"/>
-        </w:rPr>
-        <w:t xml:space="preserve">Built FastAPI services using LangGraph agents, RAG, MCP servers and AI-driven UI widgets; cut container build and startup time by </w:t>
+        <w:t xml:space="preserve">Owned two FastAPI services end to end: build and startup time down </w:t>
       </w:r>
       <w:r>
         <w:rPr>
@@ -502,7 +504,22 @@
           <w:b w:val="0"/>
           <w:i w:val="0"/>
         </w:rPr>
-        <w:t>; added OpenTelemetry and Grafana.</w:t>
+        <w:t>, OpenTelemetry and Grafana, pytest in pre-commit hooks.</w:t>
+      </w:r>
+    </w:p>
+    <w:p>
+      <w:pPr>
+        <w:spacing w:before="200" w:after="60"/>
+      </w:pPr>
+      <w:r>
+        <w:rPr>
+          <w:rFonts w:ascii="Times New Roman" w:hAnsi="Times New Roman" w:eastAsia="Times New Roman"/>
+          <w:b/>
+          <w:i w:val="0"/>
+          <w:color w:val="2E74B5"/>
+          <w:sz w:val="24"/>
+        </w:rPr>
+        <w:t>EARLIER EXPERIENCE</w:t>
       </w:r>
     </w:p>
     <w:p>
@@ -542,7 +559,7 @@
           <w:b w:val="0"/>
           <w:i/>
         </w:rPr>
-        <w:t xml:space="preserve"> | Thailand | Aug 2024 - Dec 2025 | Part-time from May 2025</w:t>
+        <w:t xml:space="preserve"> | Full-time Aug 2024 - May 2025, part-time to Dec 2025</w:t>
       </w:r>
     </w:p>
     <w:p>
@@ -704,7 +721,7 @@
     </w:p>
     <w:p>
       <w:pPr>
-        <w:spacing w:before="160" w:after="40"/>
+        <w:spacing w:before="200" w:after="60"/>
       </w:pPr>
       <w:r>
         <w:rPr>
@@ -756,7 +773,7 @@
           <w:b w:val="0"/>
           <w:i w:val="0"/>
         </w:rPr>
-        <w:t>LLM APIs (OpenAI, Gemini, Claude), agent runtimes, tool calling, LangGraph, RAG, MCP</w:t>
+        <w:t>LLM APIs (OpenAI, Gemini, Claude), agent runtimes, tool calling, Google ADK, RAG, MCP</w:t>
       </w:r>
     </w:p>
     <w:p>
@@ -824,7 +841,7 @@
     </w:p>
     <w:p>
       <w:pPr>
-        <w:spacing w:before="160" w:after="40"/>
+        <w:spacing w:before="200" w:after="60"/>
       </w:pPr>
       <w:r>
         <w:rPr>
@@ -899,7 +916,7 @@
     </w:p>
     <w:p>
       <w:pPr>
-        <w:spacing w:before="160" w:after="40"/>
+        <w:spacing w:before="200" w:after="60"/>
       </w:pPr>
       <w:r>
         <w:rPr>

</xml_diff>